<commit_message>
docs: Update Video 1 & Video 2 voiceover scripts incorporating Google Antigravity Agentic AI credits
</commit_message>
<xml_diff>
--- a/Kich_Ban_Thoai_Video_1_va_2_DoAn_ATTT.docx
+++ b/Kich_Ban_Thoai_Video_1_va_2_DoAn_ATTT.docx
@@ -36,6 +36,8 @@
         <w:t>Lớp: Chuyên ngành An toàn Thông tin - Trường Đại học Văn Hiến</w:t>
         <w:br/>
         <w:t>Giảng viên hướng dẫn: ThS. Lương Thái Hiền &amp; ThS. Nguyễn Thị Diệu Anh</w:t>
+        <w:br/>
+        <w:t>Nền tảng Hỗ trợ Phát triển AI &amp; DevSecOps: Google Antigravity Advanced Agentic AI</w:t>
       </w:r>
     </w:p>
     <w:p>
@@ -186,14 +188,16 @@
           </w:tcPr>
           <w:p>
             <w:r>
-              <w:t>"Đầu tiên, về mặt kiến trúc đóng gói, toàn bộ hệ thống của em được chuẩn hóa theo mô hình DevSecOps với 5 microservices được định nghĩa trong tệp docker-compose.yml:</w:t>
+              <w:t>"Đặc biệt, toàn bộ kiến trúc đóng gói hạ tầng Docker Container và bộ tường lửa AI WAF của đồ án đều được thiết kế, tối ưu hóa và hỗ trợ lập trình chuyên sâu nhờ nền tảng Trí tuệ Nhân tạo thế hệ mới Google Antigravity Advanced Agentic AI!</w:t>
               <w:br/>
+              <w:br/>
+              <w:t>Hệ thống được đóng gói theo mô hình DevSecOps với 5 microservices chuẩn hóa trong docker-compose.yml:</w:t>
               <w:br/>
               <w:t>1. nginx-proxy: Cổng chào Reverse Proxy mã hóa HTTPS TLS 1.3 Cổng 8443.</w:t>
               <w:br/>
-              <w:t>2. secure-app: Ứng dụng Web nghiệp vụ C# ASP.NET Core 8 tích hợp Tường lửa AI-Driven WAF.</w:t>
+              <w:t>2. secure-app: Ứng dụng Web nghiệp vụ C# ASP.NET Core 8 tích hợp Tường lửa AI WAF.</w:t>
               <w:br/>
-              <w:t>3. postgres-db: Cơ sở dữ liệu lưu trữ nghiệp vụ PostgreSQL 16 đặt trong vùng mạng kín.</w:t>
+              <w:t>3. postgres-db: Cơ sở dữ liệu lưu trữ PostgreSQL 16 đặt trong vùng mạng kín.</w:t>
               <w:br/>
               <w:t>4. redis-cache: Bộ nhớ đệm phân tán Redis 7 Alpine đồng bộ IP bị khóa dưới 1ms.</w:t>
               <w:br/>
@@ -238,7 +242,7 @@
               <w:t>"Tiếp theo, em thực hiện kết nối SSH từ máy trạm vào máy chủ đám mây AWS EC2 ARM64 tại địa chỉ IP 3.1.210.184.</w:t>
               <w:br/>
               <w:br/>
-              <w:t>Tại đây, em thực thi lệnh docker-compose up -d --build. Hệ thống sẽ tự động biên dịch mã nguồn C# .NET 8, tải các image chính thống từ Docker Hub và khởi tạo mạng ảo cách ly secure-net để liên kết 5 container lại với nhau."</w:t>
+              <w:t>Tại đây, em thực thi lệnh docker-compose up -d --build. Hệ thống tự động biên dịch mã nguồn C# .NET 8, tải các image chính thống từ Docker Hub và khởi tạo mạng ảo cách ly secure-net để liên kết 5 container lại với nhau."</w:t>
             </w:r>
           </w:p>
         </w:tc>
@@ -355,7 +359,7 @@
           </w:tcPr>
           <w:p>
             <w:r>
-              <w:t>"Như vậy, quá trình cài đặt, cấu hình hạ tầng DevSecOps trên đám mây AWS EC2 và khởi chạy trọn vẹn hệ thống đã hoàn thành xuất sắc.</w:t>
+              <w:t>"Như vậy, quá trình cài đặt, cấu hình hạ tầng DevSecOps Docker Container trên đám mây AWS EC2 dưới sự hỗ trợ phát triển của nền tảng AI Google Antigravity đã hoàn thành xuất sắc.</w:t>
               <w:br/>
               <w:br/>
               <w:t>Em xin chân thành cảm ơn Thầy Cô đã theo dõi Video 1. Em xin phép kết thúc video tại đây và chuyển sang Video 2 trình bày kịch bản thực nghiệm kết quả!"</w:t>
@@ -504,7 +508,7 @@
           </w:tcPr>
           <w:p>
             <w:r>
-              <w:t>"Chào Thầy Cô, sau đây em xin trình bày Video 2: Thực nghiệm các kịch bản kiểm thử tấn công và đánh giá phản ứng sự cố.</w:t>
+              <w:t>"Chào Thầy Cô, sau đây em xin trình bày Video 2: Thực nghiệm các kịch bản kiểm thử tấn công và đánh giá phản ứng sự cố của bộ Tường lửa AI WAF phát triển trên nền tảng Google Antigravity AI Engine.</w:t>
               <w:br/>
               <w:br/>
               <w:t>Đầu tiên, người dùng hợp lệ truy cập qua HTTPS mã hóa TLS 1.3 Cổng 8443. Khi tìm kiếm từ khóa 'laptop', hệ thống phản hồi HTTP 200 OK bình thường."</w:t>
@@ -546,7 +550,7 @@
               <w:t>"Tiếp theo, Kẻ tấn công thực hiện chèn câu lệnh SQL Injection ' UNION SELECT 1,2,3--.</w:t>
               <w:br/>
               <w:br/>
-              <w:t>Tường lửa AI WAF ngay lập tức trích xuất n-gram, tính toán xác suất độc hại đạt 96.6% và ngắt kết nối trả về HTTP 400 Bad Request.</w:t>
+              <w:t>Tường lửa AI WAF phát triển qua Google Antigravity ngay lập tức trích xuất n-gram, tính toán xác suất độc hại đạt 96.6% và ngắt kết nối trả về HTTP 400 Bad Request.</w:t>
               <w:br/>
               <w:br/>
               <w:t>Đồng thời, Telegram Bot API lập tức phát tin nhắn cảnh báo khẩn cấp đỏ về điện thoại của Admin chứa chi tiết IP, vị trí GeoIP, đường dẫn URI và chuỗi mã độc!"</w:t>
@@ -694,7 +698,7 @@
               <w:t>"Cuối cùng là thực nghiệm cơ chế Whitelist IP Bypass. Khi thêm IP máy trạm vào danh sách Whitelist, mọi yêu cầu thử nghiệm đều được cho qua với HTTP 200 OK, minh chứng PoC tính năng bảo trì hệ thống.</w:t>
               <w:br/>
               <w:br/>
-              <w:t>Em xin chân thành cảm ơn Thầy Cô đã theo dõi!"</w:t>
+              <w:t>Toàn bộ mô hình Docker DevSecOps và Tường lửa AI WAF xây dựng với sự hỗ trợ của Google Antigravity AI đã hoàn thành xuất sắc các kịch bản thực nghiệm. Em xin chân thành cảm ơn Thầy Cô đã theo dõi!"</w:t>
             </w:r>
           </w:p>
         </w:tc>

</xml_diff>

<commit_message>
docs: Refine voiceover script to focus purely on WAF & Security Architecture without mentioning target web app business details
</commit_message>
<xml_diff>
--- a/Kich_Ban_Thoai_Video_1_va_2_DoAn_ATTT.docx
+++ b/Kich_Ban_Thoai_Video_1_va_2_DoAn_ATTT.docx
@@ -14,7 +14,7 @@
         </w:rPr>
         <w:t>KỊCH BẢN LỜI THOẠI QUAY VIDEO THỰC HÀNH BẢO VỆ ĐỒ ÁN</w:t>
         <w:br/>
-        <w:t>AN TOÀN THÔNG TIN WEB TRÊN NỀN TẢNG DOCKER CONTAINER</w:t>
+        <w:t>NÂNG CAO AN NINH VÀ TRIỂN KHAI TƯỜNG LỬA AI WAF TRÊN DOCKER</w:t>
       </w:r>
     </w:p>
     <w:p>
@@ -46,7 +46,7 @@
           <w:color w:val="003366"/>
           <w:sz w:val="28"/>
         </w:rPr>
-        <w:t>PART 1: KỊCH BẢN VIDEO 1 - THIẾT LẬP VÀ CẤU HÌNH HỆ THỐNG (THỜI LƯỢNG: ~3 PHÚT 30 GIÂY)</w:t>
+        <w:t>PART 1: KỊCH BẢN VIDEO 1 - THIẾT LẬP VÀ CẤU HÌNH HỆ THỐNG AN NINH WAF (THỜI LƯỢNG: ~3 PHÚT 30 GIÂY)</w:t>
       </w:r>
     </w:p>
     <w:tbl>
@@ -133,7 +133,7 @@
                 <w:color w:val="FFFFFF"/>
                 <w:sz w:val="22"/>
               </w:rPr>
-              <w:t>Lời thoại thuyết minh (Voiceover Script)</w:t>
+              <w:t>Lời thoại thuyết minh (Tập trung Tường lửa AI WAF)</w:t>
             </w:r>
           </w:p>
         </w:tc>
@@ -218,7 +218,7 @@
               <w:rPr>
                 <w:sz w:val="22"/>
               </w:rPr>
-              <w:t>"Xin chào Thầy/Cô và các bạn! Em tên là Võ Quốc Thắng, MSSV 231A011150, sinh viên ngành An toàn Thông tin - Trường Đại học Văn Hiến. Hôm nay em xin trình bày video hướng dẫn thiết lập và vận hành đề tài đồ án chuyên ngành: 'Nghiên cứu và triển khai hệ thống giám sát tự động, phản ứng sự cố và bảo vệ ứng dụng Web trên nền tảng Docker Container'. Toàn bộ hệ thống được xây dựng và tối ưu hóa chuyên sâu trên môi trường phát triển Google Antigravity Advanced Agentic AI Platform, cho phép quản lý mã nguồn và thực thi các lệnh Terminal linh hoạt thông qua tính năng Open IDE và phím tắt Ctrl + ~."</w:t>
+              <w:t>"Xin chào Thầy/Cô và các bạn! Em tên là Võ Quốc Thắng, MSSV 231A011150, sinh viên ngành An toàn Thông tin - Trường Đại học Văn Hiến. Hôm nay em xin trình bày video hướng dẫn thiết lập và vận hành hệ thống Tường lửa bảo vệ ứng dụng Web: 'Nghiên cứu và triển khai hệ thống giám sát tự động, phản ứng sự cố và bảo vệ ứng dụng Web trên nền tảng Docker Container'. Toàn bộ giải pháp bảo mật được phát triển và tối ưu hóa chuyên sâu trên môi trường Google Antigravity Advanced Agentic AI Platform, hỗ trợ quản lý dự án và mở Terminal trực tiếp thông qua nút Open IDE và phím tắt Ctrl + ~."</w:t>
             </w:r>
           </w:p>
         </w:tc>
@@ -311,7 +311,7 @@
               <w:rPr>
                 <w:sz w:val="22"/>
               </w:rPr>
-              <w:t>"Về mặt kiến trúc hạ tầng, đồ án sử dụng Docker Compose để đóng gói và vận hành 5 container microservices biệt lập hoàn toàn trong mạng nội bộ secure-net. Đầu tiên là nginx-proxy đóng vai trò cổng Reverse Proxy tiếp nhận traffic mã hóa HTTPS TLS 1.3 và cấu hình 5 lớp Enterprise Security Headers. Phía sau là secure-app chạy ứng dụng Web ASP.NET Core 8 dưới quyền Non-root User app. Tiếp theo là redis-cache phục vụ bộ đệm Pub/Sub đồng bộ IP chặn với độ trễ dưới 1 millisecond. CSDL PostgreSQL 16 và Redis hoàn toàn không mở cổng ra ngoài host để đảm bảo an toàn tuyệt đối. Cuối cùng là monitor-module chịu trách nhiệm giám sát real-time và xuất log SIEM."</w:t>
+              <w:t>"Về mặt kiến trúc hạ tầng an ninh, hệ thống sử dụng Docker Compose để vận hành 5 container microservices biệt lập hoàn toàn trong mạng ảo secure-net. Tiền tuyến là nginx-proxy đóng vai trò cổng Gateway Reverse Proxy tiếp nhận kết nối mã hóa HTTPS TLS 1.3 và thiết lập 5 lớp Enterprise Security Headers, tự động chuyên hướng HTTP 301 sang HTTPS. Phía sau là secure-app đóng vai trò dịch vụ Web mục tiêu được bảo vệ bởi AI WAF Middleware, thực thi dưới quyền Non-root User app. Hệ thống sử dụng redis-cache cho bộ đệm Pub/Sub chia sẻ IP bị chặn tức thì dưới 1 millisecond. CSDL PostgreSQL và Redis hoàn toàn không mở cổng ra ngoài host để triệt tiêu bề mặt tấn công. Cuối cùng là monitor-module chịu trách nhiệm giám sát an toàn thông tin và xuất log SIEM."</w:t>
             </w:r>
           </w:p>
         </w:tc>
@@ -398,7 +398,7 @@
               <w:rPr>
                 <w:sz w:val="22"/>
               </w:rPr>
-              <w:t>"Điểm đột phá cốt lõi của đồ án là Tường lửa AI-Driven WAF được nhúng trực tiếp vào Middleware của secure-app. WAF loại bỏ hoàn toàn các bộ quy tắc Regex tĩnh truyền thống, thay vào đó ứng dụng thuật toán SDCA Logistic Regression huấn luyện từ tập dữ liệu 34.741 mẫu độc hại và lành tính. Trước khi đưa vào mô hình AI suy luận, dữ liệu trải qua lớp tiền xử lý giải mã 3 tầng URL/HTML Entity để chống kỹ thuật Evasion ngụy trang, đồng thời lọc bỏ hoàn toàn các câu lệnh comment độc hại. Hệ thống cũng tích hợp cơ chế lắng nghe kênh Redis Pub/Sub blocked-ips-channel, giúp nhận lệnh khóa IP độc hại ngay lập tức mà không gây trễ I/O."</w:t>
+              <w:t>"Trái tim của giải pháp là Tường lửa AI-Driven WAF được tích hợp trực tiếp vào luồng xử lý Middleware của ứng dụng Web. WAF loại bỏ hoàn toàn việc sử dụng các quy tắc Regex tĩnh dễ bị qua mặt, thay vào đó ứng dụng thuật toán Học máy SDCA Logistic Regression huấn luyện từ tập dữ liệu 34.741 mẫu độc hại và lành tính. Trước khi đưa vào mô hình AI suy luận, dữ liệu trải qua lớp tiền xử lý giải mã 3 tầng URL và HTML Entity để chống kỹ thuật Evasion ngụy trang, đồng thời lọc bỏ hoàn toàn các câu lệnh comment độc hại. Hệ thống cũng tích hợp cơ chế lắng nghe kênh Redis Pub/Sub blocked-ips-channel, giúp cập nhật danh sách IP bị chặn tức thì mà không gây độ trễ I/O."</w:t>
             </w:r>
           </w:p>
         </w:tc>
@@ -483,7 +483,7 @@
               <w:rPr>
                 <w:sz w:val="22"/>
               </w:rPr>
-              <w:t>"Song song đó, container monitor-module thực hiện đọc trực tiếp luồng sự kiện từ Docker Socket qua file /var/run/docker.sock. Module sử dụng thuật toán Cửa sổ trượt Sliding Window đếm tần suất truy cập lỗi 404 để tự động phát hiện các cuộc rà quét thư mục ẩn. Dashboard quản trị tại cổng 5001 được bảo vệ nghiêm ngặt bằng cơ chế xác thực 2 lớp TOTP MFA Google Authenticator và tính năng khóa đăng nhập khi nhập sai 5 lần. Ngoài ra, hệ thống tích hợp Telegram Bot tự động gửi cảnh báo khẩn cấp và cho phép Quản trị viên phát lệnh điều khiển từ xa trực tiếp từ điện thoại."</w:t>
+              <w:t>"Song song đó, container monitor-module thực hiện đọc luồng sự kiện thời gian thực từ Docker Socket qua file /var/run/docker.sock. Module sử dụng thuật toán Cửa sổ trượt Sliding Window đếm tần suất truy cập lỗi 404 để tự động nhận diện hành vi rà quét thư mục ẩn bất thường. Bảng điều khiển giám sát Dashboard tại cổng 5001 được bảo vệ nghiêm ngặt bằng xác thực 2 lớp TOTP MFA Google Authenticator và tính năng Anti-Brute Force tự động khóa khi nhập sai 5 lần. Ngoài ra, module tích hợp Telegram Bot gửi cảnh báo khẩn cấp và hỗ trợ Quản trị viên phát lệnh điều khiển từ xa trực tiếp từ điện thoại."</w:t>
             </w:r>
           </w:p>
         </w:tc>
@@ -568,7 +568,7 @@
               <w:rPr>
                 <w:sz w:val="22"/>
               </w:rPr>
-              <w:t>"Bây giờ em tiến hành khởi chạy hệ thống bằng lệnh docker compose up -d --build trong Terminal của Antigravity. Như Thầy/Cô có thể thấy, toàn bộ 5 container đã được biên dịch, nạp bộ não AI WAF vào thư mục tạm /tmp/waf_model.zip và kích hoạt trạng thái Healthy thành công. Xin mời Thầy/Cô cùng theo dõi Video thứ 2 để xem màn trình diễn kiểm thử các kịch bản tấn công thực tế trên máy chủ đám mây AWS EC2."</w:t>
+              <w:t>"Bây giờ em tiến hành khởi chạy toàn bộ hạ tầng bảo vệ bằng lệnh docker compose up -d --build trong Terminal của Antigravity. Như Thầy/Cô thấy, cả 5 container an ninh đã được biên dịch thành công, bộ não AI WAF được nạp vào thư mục tạm /tmp/waf_model.zip và sẵn sàng hoạt động ở trạng thái Healthy. Xin mời Thầy/Cô cùng theo dõi Video thứ 2 để xem màn trình diễn kiểm thử khả năng phòng thủ của Tường lửa AI WAF trên máy chủ AWS EC2."</w:t>
             </w:r>
           </w:p>
         </w:tc>
@@ -586,7 +586,7 @@
           <w:color w:val="003366"/>
           <w:sz w:val="28"/>
         </w:rPr>
-        <w:t>PART 2: KỊCH BẢN VIDEO 2 - TRIỂN KHAI AWS EC2 VÀ THỬ NGHIỆM TẤN CÔNG THỰC TẾ (THỜI LƯỢNG: ~5 PHÚT)</w:t>
+        <w:t>PART 2: KỊCH BẢN VIDEO 2 - TRIỂN KHAI AWS EC2 VÀ THỬ NGHIỆM PHÒNG THỦ AI WAF THỰC TẾ (THỜI LƯỢNG: ~5 PHÚT)</w:t>
       </w:r>
     </w:p>
     <w:tbl>
@@ -673,7 +673,7 @@
                 <w:color w:val="FFFFFF"/>
                 <w:sz w:val="22"/>
               </w:rPr>
-              <w:t>Lời thoại thuyết minh (Voiceover Script)</w:t>
+              <w:t>Lời thoại thuyết minh (Tập trung Tường lửa AI WAF)</w:t>
             </w:r>
           </w:p>
         </w:tc>
@@ -756,7 +756,7 @@
               <w:rPr>
                 <w:sz w:val="22"/>
               </w:rPr>
-              <w:t>"Chào mừng Thầy/Cô đến với Video 2: Trình diễn kiểm thử hệ thống thực tế trên hạ tầng đám mây AWS EC2 tại địa chỉ IP 3.1.210.184. Như quan sát trên màn hình, khi người dùng truy cập giao diện ứng dụng qua cổng 8080 HTTP, Nginx Gateway lập tức thực hiện chuyển hướng 301 Permanent sang kết nối mã hóa HTTPS bảo mật. Kiểm tra trên Developer Tools, giao diện đạt chuẩn TLS 1.3 cùng trọn bộ 5 lớp Enterprise Security Headers gồm Strict-Transport-Security, X-Frame-Options, X-Content-Type-Options, X-XSS-Protection và Referrer-Policy."</w:t>
+              <w:t>"Chào mừng Thầy/Cô đến với Video 2: Trình diễn kiểm thử khả năng phòng thủ của hệ thống trên máy chủ đám mây AWS EC2 tại địa chỉ IP 3.1.210.184. Đầu tiên là lớp bảo vệ Nginx Gateway: Khi truy cập qua cổng 8080 HTTP, Nginx lập tức chuyển hướng 301 Permanent sang kết nối mã hóa HTTPS bảo mật. Kiểm tra trên DevTools, kết nối đạt chuẩn TLS 1.3 cùng trọn bộ 5 lớp Enterprise Security Headers gồm Strict-Transport-Security, X-Frame-Options, X-Content-Type-Options, X-XSS-Protection và Referrer-Policy."</w:t>
             </w:r>
           </w:p>
         </w:tc>
@@ -845,7 +845,7 @@
               <w:rPr>
                 <w:sz w:val="22"/>
               </w:rPr>
-              <w:t>"Tiếp theo, em mở Dashboard quản trị an ninh tại cổng 5001. Hệ thống yêu cầu xác thực đa nhân tố TOTP MFA theo tiêu chuẩn RFC 6238. Em nhập Email quản trị voquocthang18092005@gmail.com và mở ứng dụng Google Authenticator trên điện thoại thông minh để lấy mã OTP ngẫu nhiên biến đổi mỗi 30 giây. Nếu kẻ gian cố tình thử đoán mã quá 5 lần, tính năng Anti-Brute Force Lockout sẽ lập tức khóa thiết bị trong 5 phút. Nhập mã OTP chính xác, em đã truy cập thành công vào giao diện giám sát thời gian thực."</w:t>
+              <w:t>"Tiếp theo, em mở Bảng điều khiển giám sát an ninh tại cổng 5001. Giao diện yêu cầu xác thực 2 lớp TOTP MFA theo tiêu chuẩn RFC 6238. Em nhập Email quản trị voquocthang18092005@gmail.com và mở ứng dụng Google Authenticator trên điện thoại để lấy mã OTP ngẫu nhiên biến đổi mỗi 30 giây. Nếu kẻ gian cố tình dò mã quá 5 lần, tính năng Anti-Brute Force Lockout sẽ lập tức khóa thiết bị trong 5 phút. Nhập mã OTP chính xác, em đã truy cập vào giao diện giám sát an toàn thông tin thời gian thực."</w:t>
             </w:r>
           </w:p>
         </w:tc>
@@ -900,7 +900,7 @@
                 <w:i/>
                 <w:sz w:val="21"/>
               </w:rPr>
-              <w:t>• Mở trang web ứng dụng nghiệp vụ.</w:t>
+              <w:t>• Mở trang Web kiểm thử WAF.</w:t>
               <w:br/>
               <w:t>• Thao tác tấn công SQL Injection:</w:t>
               <w:br/>
@@ -936,7 +936,7 @@
               <w:rPr>
                 <w:sz w:val="22"/>
               </w:rPr>
-              <w:t>"Sau đây em tiến hành giả lập các kịch bản tấn công nguy hiểm trong OWASP Top 10. Kịch bản 1: Em chèn câu lệnh SQL Injection SELECT * FROM users WHERE '1'='1' vào ô tìm kiếm. Ngay lập tức, Middleware AI WAF phân tích vector N-gram, tính toán điểm xác suất độc hại vượt ngưỡng 70% và trả về phản hồi HTTP 400 Bad Request. Kịch bản 2: Em thử chèn mã độc Cross-Site Scripting &lt;script&gt;alert('XSS')&lt;/script&gt;. Lớp tiệt trùng dữ liệu và mô hình AI đã phát hiện và chặn đứng cuộc tấn công trong chưa đầy 1.5 millisecond mà không cần dùng bất kỳ bộ luật Regex tĩnh nào."</w:t>
+              <w:t>"Bây giờ em tiến hành kiểm thử khả năng chặn mã độc của Tường lửa AI WAF đối với các cuộc tấn công OWASP Top 10. Thử nghiệm 1: Em gửi câu lệnh SQL Injection SELECT * FROM users WHERE '1'='1'. Ngay lập tức, Middleware AI WAF phân tích vector N-gram, tính điểm xác suất độc hại &gt; 70% và trả về phản hồi HTTP 400 Bad Request. Thử nghiệm 2: Em gửi câu lệnh Cross-Site Scripting &lt;script&gt;alert('XSS')&lt;/script&gt;. Lớp tiệt trùng dữ liệu và bộ não AI đã phát hiện và chặn đứng đòn tấn công trong chưa đầy 1.5 millisecond mà không cần sử dụng bất kỳ luật Regex tĩnh nào."</w:t>
             </w:r>
           </w:p>
         </w:tc>
@@ -1021,7 +1021,7 @@
               <w:rPr>
                 <w:sz w:val="22"/>
               </w:rPr>
-              <w:t>"Kịch bản 3: Giả lập cuộc tấn công rà quét thư mục ẩn Directory Brute-force bằng công cụ tự động. Em kích hoạt script gửi 10 yêu cầu truy cập các tệp nhạy cảm liên tiếp. Sau khi ghi nhận quá 5 lỗi 404 trong cửa sổ 60 giây, thuật toán Sliding Window tại monitor-module đã phát tín hiệu khóa IP lên kênh Redis Pub/Sub. Chỉ trong chưa đầy 1 millisecond, toàn bộ các máy chủ secure-app đều nhận được lệnh chặn và tự động từ chối mọi yêu cầu tiếp theo với phản hồi HTTP 403 Forbidden vĩnh viễn."</w:t>
+              <w:t>"Thử nghiệm 3: Kiểm thử khả năng nhận diện hành vi rà quét bất thường bằng công cụ tự động. Em kích hoạt script gửi 10 yêu cầu truy cập liên tiếp vào các đường dẫn không tồn tại. Sau khi ghi nhận quá 5 lỗi 404 trong 60 giây, thuật toán Sliding Window tại monitor-module tự động phát tín hiệu khóa IP lên kênh Redis Pub/Sub. Chỉ trong chưa đầy 1 millisecond, Tường lửa WAF đã tự động từ chối mọi yêu cầu tiếp theo từ địa chỉ IP này với phản hồi HTTP 403 Forbidden vĩnh viễn."</w:t>
             </w:r>
           </w:p>
         </w:tc>
@@ -1110,7 +1110,7 @@
               <w:rPr>
                 <w:sz w:val="22"/>
               </w:rPr>
-              <w:t>"Đồng thời, hệ thống lập tức gửi tin nhắn cảnh báo khẩn cấp về ứng dụng Telegram của Quản trị viên với đầy đủ thông tin địa chỉ IP, vị trí địa lý GeoIP và mẫu payload vi phạm. Đặc biệt, em có thể thao tác quản trị trực tiếp từ xa thông qua hệ thống lệnh của Telegram Bot: Gõ /list_blocked để kiểm tra danh sách IP bị khóa, gõ /unblock để mở khóa cho người dùng nhầm lẫn, hoặc gõ /start_web để khởi động lại container dịch vụ mà không cần đăng nhập vào server Linux."</w:t>
+              <w:t>"Song song với việc chặn tấn công, hệ thống tự động gửi tin nhắn cảnh báo khẩn cấp về Telegram của Quản trị viên kèm IP, vị trí địa lý GeoIP và payload vi phạm. Đặc biệt, Quản trị viên có thể thao tác điều khiển Tường lửa từ xa ngay trên Telegram: Gõ /list_blocked để xem danh sách IP đang bị khóa, gõ /unblock để mở khóa cho địa chỉ IP tin cậy, hoặc gõ /start_web để khởi động lại dịch vụ Web khi cần thiết mà không cần truy cập trực tiếp vào máy chủ Linux."</w:t>
             </w:r>
           </w:p>
         </w:tc>
@@ -1199,7 +1199,7 @@
               <w:rPr>
                 <w:sz w:val="22"/>
               </w:rPr>
-              <w:t>"Tổng kết lại, đồ án đã triển khai thành công một giải pháp an ninh đa lớp toàn diện với độ chính xác nhận diện mã độc đạt 98.37%, độ trễ xử lý cực thấp dưới 1.8ms và khả năng tự động hóa phản ứng sự cố vượt trội. Đồ án minh chứng rõ ràng cho tính khả thi khi ứng dụng Trí tuệ nhân tạo và công nghệ Container vào bài toán bảo vệ hạ tầng Web doanh nghiệp. Em xin chân thành cảm ơn Quý Thầy/Cô đã lắng nghe và theo dõi!"</w:t>
+              <w:t>"Tổng kết lại, đồ án đã nghiên cứu và triển khai thành công giải pháp Tường lửa AI-Driven WAF kết hợp giám sát tự động với độ chính xác nhận diện mã độc 98.37%, độ trễ xử lý cực thấp dưới 1.8ms và khả năng phản ứng sự cố thời gian thực vượt trội. Giải pháp khẳng định tính hiệu quả cao trong việc bảo vệ hạ tầng ứng dụng Web doanh nghiệp. Em xin chân thành cảm ơn Quý Thầy/Cô đã lắng nghe và theo dõi!"</w:t>
             </w:r>
           </w:p>
         </w:tc>

</xml_diff>